<commit_message>
we added update user option
</commit_message>
<xml_diff>
--- a/lesson1 4.11.25/github link.docx
+++ b/lesson1 4.11.25/github link.docx
@@ -3,9 +3,48 @@
 <w:document xmlns:wpc="http://schemas.microsoft.com/office/word/2010/wordprocessingCanvas" xmlns:cx="http://schemas.microsoft.com/office/drawing/2014/chartex" xmlns:cx1="http://schemas.microsoft.com/office/drawing/2015/9/8/chartex" xmlns:cx2="http://schemas.microsoft.com/office/drawing/2015/10/21/chartex" xmlns:cx3="http://schemas.microsoft.com/office/drawing/2016/5/9/chartex" xmlns:cx4="http://schemas.microsoft.com/office/drawing/2016/5/10/chartex" xmlns:cx5="http://schemas.microsoft.com/office/drawing/2016/5/11/chartex" xmlns:cx6="http://schemas.microsoft.com/office/drawing/2016/5/12/chartex" xmlns:cx7="http://schemas.microsoft.com/office/drawing/2016/5/13/chartex" xmlns:cx8="http://schemas.microsoft.com/office/drawing/2016/5/14/chartex" xmlns:mc="http://schemas.openxmlformats.org/markup-compatibility/2006" xmlns:aink="http://schemas.microsoft.com/office/drawing/2016/ink" xmlns:am3d="http://schemas.microsoft.com/office/drawing/2017/model3d" xmlns:o="urn:schemas-microsoft-com:office:office" xmlns:oel="http://schemas.microsoft.com/office/2019/extlst" xmlns:r="http://schemas.openxmlformats.org/officeDocument/2006/relationships" xmlns:m="http://schemas.openxmlformats.org/officeDocument/2006/math" xmlns:v="urn:schemas-microsoft-com:vml" xmlns:wp14="http://schemas.microsoft.com/office/word/2010/wordprocessingDrawing" xmlns:wp="http://schemas.openxmlformats.org/drawingml/2006/wordprocessingDrawing" xmlns:w10="urn:schemas-microsoft-com:office:word" xmlns:w="http://schemas.openxmlformats.org/wordprocessingml/2006/main" xmlns:w14="http://schemas.microsoft.com/office/word/2010/wordml" xmlns:w15="http://schemas.microsoft.com/office/word/2012/wordml" xmlns:w16cex="http://schemas.microsoft.com/office/word/2018/wordml/cex" xmlns:w16cid="http://schemas.microsoft.com/office/word/2016/wordml/cid" xmlns:w16="http://schemas.microsoft.com/office/word/2018/wordml" xmlns:w16du="http://schemas.microsoft.com/office/word/2023/wordml/word16du" xmlns:w16sdtdh="http://schemas.microsoft.com/office/word/2020/wordml/sdtdatahash" xmlns:w16sdtfl="http://schemas.microsoft.com/office/word/2024/wordml/sdtformatlock" xmlns:w16se="http://schemas.microsoft.com/office/word/2015/wordml/symex" xmlns:wpg="http://schemas.microsoft.com/office/word/2010/wordprocessingGroup" xmlns:wpi="http://schemas.microsoft.com/office/word/2010/wordprocessingInk" xmlns:wne="http://schemas.microsoft.com/office/word/2006/wordml" xmlns:wps="http://schemas.microsoft.com/office/word/2010/wordprocessingShape" mc:Ignorable="w14 w15 w16se w16cid w16 w16cex w16sdtdh w16sdtfl w16du wp14">
   <w:body>
     <w:p>
-      <w:r>
-        <w:t>https://github.com/yehuda-d/ToDoList2</w:t>
-      </w:r>
+      <w:pPr>
+        <w:rPr>
+          <w:rFonts w:hint="cs"/>
+          <w:rtl/>
+        </w:rPr>
+      </w:pPr>
+    </w:p>
+    <w:p>
+      <w:pPr>
+        <w:rPr>
+          <w:rFonts w:hint="cs"/>
+          <w:rtl/>
+        </w:rPr>
+      </w:pPr>
+    </w:p>
+    <w:p>
+      <w:pPr>
+        <w:rPr>
+          <w:rFonts w:hint="cs"/>
+          <w:rtl/>
+        </w:rPr>
+      </w:pPr>
+      <w:hyperlink r:id="rId4" w:history="1">
+        <w:r>
+          <w:rPr>
+            <w:rStyle w:val="Hyperlink"/>
+          </w:rPr>
+          <w:t>https://github.com</w:t>
+        </w:r>
+        <w:r>
+          <w:rPr>
+            <w:rStyle w:val="Hyperlink"/>
+          </w:rPr>
+          <w:t>/</w:t>
+        </w:r>
+        <w:r>
+          <w:rPr>
+            <w:rStyle w:val="Hyperlink"/>
+          </w:rPr>
+          <w:t>yehuda-d/ToDoList2/tree/main</w:t>
+        </w:r>
+      </w:hyperlink>
     </w:p>
     <w:sectPr>
       <w:pgSz w:w="11906" w:h="16838"/>
@@ -939,6 +978,41 @@
       <w:spacing w:val="5"/>
     </w:rPr>
   </w:style>
+  <w:style w:type="character" w:styleId="Hyperlink">
+    <w:name w:val="Hyperlink"/>
+    <w:basedOn w:val="a0"/>
+    <w:uiPriority w:val="99"/>
+    <w:unhideWhenUsed/>
+    <w:rsid w:val="00A752C5"/>
+    <w:rPr>
+      <w:color w:val="467886" w:themeColor="hyperlink"/>
+      <w:u w:val="single"/>
+    </w:rPr>
+  </w:style>
+  <w:style w:type="character" w:styleId="ae">
+    <w:name w:val="Unresolved Mention"/>
+    <w:basedOn w:val="a0"/>
+    <w:uiPriority w:val="99"/>
+    <w:semiHidden/>
+    <w:unhideWhenUsed/>
+    <w:rsid w:val="00A752C5"/>
+    <w:rPr>
+      <w:color w:val="605E5C"/>
+      <w:shd w:val="clear" w:color="auto" w:fill="E1DFDD"/>
+    </w:rPr>
+  </w:style>
+  <w:style w:type="character" w:styleId="FollowedHyperlink">
+    <w:name w:val="FollowedHyperlink"/>
+    <w:basedOn w:val="a0"/>
+    <w:uiPriority w:val="99"/>
+    <w:semiHidden/>
+    <w:unhideWhenUsed/>
+    <w:rsid w:val="00A752C5"/>
+    <w:rPr>
+      <w:color w:val="96607D" w:themeColor="followedHyperlink"/>
+      <w:u w:val="single"/>
+    </w:rPr>
+  </w:style>
 </w:styles>
 </file>
 

</xml_diff>

<commit_message>
I did changes to add user
</commit_message>
<xml_diff>
--- a/lesson1 4.11.25/github link.docx
+++ b/lesson1 4.11.25/github link.docx
@@ -13,7 +13,6 @@
     <w:p>
       <w:pPr>
         <w:rPr>
-          <w:rFonts w:hint="cs"/>
           <w:rtl/>
         </w:rPr>
       </w:pPr>
@@ -21,7 +20,6 @@
     <w:p>
       <w:pPr>
         <w:rPr>
-          <w:rFonts w:hint="cs"/>
           <w:rtl/>
         </w:rPr>
       </w:pPr>
@@ -30,19 +28,7 @@
           <w:rPr>
             <w:rStyle w:val="Hyperlink"/>
           </w:rPr>
-          <w:t>https://github.com</w:t>
-        </w:r>
-        <w:r>
-          <w:rPr>
-            <w:rStyle w:val="Hyperlink"/>
-          </w:rPr>
-          <w:t>/</w:t>
-        </w:r>
-        <w:r>
-          <w:rPr>
-            <w:rStyle w:val="Hyperlink"/>
-          </w:rPr>
-          <w:t>yehuda-d/ToDoList2/tree/main</w:t>
+          <w:t>https://github.com/yehuda-d/ToDoList2/tree/main</w:t>
         </w:r>
       </w:hyperlink>
     </w:p>

</xml_diff>

<commit_message>
we added end point to get a category
</commit_message>
<xml_diff>
--- a/lesson1 4.11.25/github link.docx
+++ b/lesson1 4.11.25/github link.docx
@@ -2,6 +2,14 @@
 <file path=word/document.xml><?xml version="1.0" encoding="utf-8"?>
 <w:document xmlns:wpc="http://schemas.microsoft.com/office/word/2010/wordprocessingCanvas" xmlns:cx="http://schemas.microsoft.com/office/drawing/2014/chartex" xmlns:cx1="http://schemas.microsoft.com/office/drawing/2015/9/8/chartex" xmlns:cx2="http://schemas.microsoft.com/office/drawing/2015/10/21/chartex" xmlns:cx3="http://schemas.microsoft.com/office/drawing/2016/5/9/chartex" xmlns:cx4="http://schemas.microsoft.com/office/drawing/2016/5/10/chartex" xmlns:cx5="http://schemas.microsoft.com/office/drawing/2016/5/11/chartex" xmlns:cx6="http://schemas.microsoft.com/office/drawing/2016/5/12/chartex" xmlns:cx7="http://schemas.microsoft.com/office/drawing/2016/5/13/chartex" xmlns:cx8="http://schemas.microsoft.com/office/drawing/2016/5/14/chartex" xmlns:mc="http://schemas.openxmlformats.org/markup-compatibility/2006" xmlns:aink="http://schemas.microsoft.com/office/drawing/2016/ink" xmlns:am3d="http://schemas.microsoft.com/office/drawing/2017/model3d" xmlns:o="urn:schemas-microsoft-com:office:office" xmlns:oel="http://schemas.microsoft.com/office/2019/extlst" xmlns:r="http://schemas.openxmlformats.org/officeDocument/2006/relationships" xmlns:m="http://schemas.openxmlformats.org/officeDocument/2006/math" xmlns:v="urn:schemas-microsoft-com:vml" xmlns:wp14="http://schemas.microsoft.com/office/word/2010/wordprocessingDrawing" xmlns:wp="http://schemas.openxmlformats.org/drawingml/2006/wordprocessingDrawing" xmlns:w10="urn:schemas-microsoft-com:office:word" xmlns:w="http://schemas.openxmlformats.org/wordprocessingml/2006/main" xmlns:w14="http://schemas.microsoft.com/office/word/2010/wordml" xmlns:w15="http://schemas.microsoft.com/office/word/2012/wordml" xmlns:w16cex="http://schemas.microsoft.com/office/word/2018/wordml/cex" xmlns:w16cid="http://schemas.microsoft.com/office/word/2016/wordml/cid" xmlns:w16="http://schemas.microsoft.com/office/word/2018/wordml" xmlns:w16du="http://schemas.microsoft.com/office/word/2023/wordml/word16du" xmlns:w16sdtdh="http://schemas.microsoft.com/office/word/2020/wordml/sdtdatahash" xmlns:w16sdtfl="http://schemas.microsoft.com/office/word/2024/wordml/sdtformatlock" xmlns:w16se="http://schemas.microsoft.com/office/word/2015/wordml/symex" xmlns:wpg="http://schemas.microsoft.com/office/word/2010/wordprocessingGroup" xmlns:wpi="http://schemas.microsoft.com/office/word/2010/wordprocessingInk" xmlns:wne="http://schemas.microsoft.com/office/word/2006/wordml" xmlns:wps="http://schemas.microsoft.com/office/word/2010/wordprocessingShape" mc:Ignorable="w14 w15 w16se w16cid w16 w16cex w16sdtdh w16sdtfl w16du wp14">
   <w:body>
+    <w:p/>
+    <w:p>
+      <w:pPr>
+        <w:rPr>
+          <w:rtl/>
+        </w:rPr>
+      </w:pPr>
+    </w:p>
     <w:p>
       <w:pPr>
         <w:rPr>
@@ -13,13 +21,7 @@
     <w:p>
       <w:pPr>
         <w:rPr>
-          <w:rtl/>
-        </w:rPr>
-      </w:pPr>
-    </w:p>
-    <w:p>
-      <w:pPr>
-        <w:rPr>
+          <w:rFonts w:hint="cs"/>
           <w:rtl/>
         </w:rPr>
       </w:pPr>
@@ -28,7 +30,19 @@
           <w:rPr>
             <w:rStyle w:val="Hyperlink"/>
           </w:rPr>
-          <w:t>https://github.com/yehuda-d/ToDoList2/tree/main</w:t>
+          <w:t>https://github.co</w:t>
+        </w:r>
+        <w:r>
+          <w:rPr>
+            <w:rStyle w:val="Hyperlink"/>
+          </w:rPr>
+          <w:t>m</w:t>
+        </w:r>
+        <w:r>
+          <w:rPr>
+            <w:rStyle w:val="Hyperlink"/>
+          </w:rPr>
+          <w:t>/yehuda-d/ToDoList2/tree/main</w:t>
         </w:r>
       </w:hyperlink>
     </w:p>

</xml_diff>

<commit_message>
we added end point to get task and delete task
</commit_message>
<xml_diff>
--- a/lesson1 4.11.25/github link.docx
+++ b/lesson1 4.11.25/github link.docx
@@ -13,7 +13,6 @@
     <w:p>
       <w:pPr>
         <w:rPr>
-          <w:rFonts w:hint="cs"/>
           <w:rtl/>
         </w:rPr>
       </w:pPr>
@@ -30,19 +29,19 @@
           <w:rPr>
             <w:rStyle w:val="Hyperlink"/>
           </w:rPr>
-          <w:t>https://github.co</w:t>
+          <w:t>https://github.com</w:t>
         </w:r>
         <w:r>
           <w:rPr>
             <w:rStyle w:val="Hyperlink"/>
           </w:rPr>
-          <w:t>m</w:t>
+          <w:t>/</w:t>
         </w:r>
         <w:r>
           <w:rPr>
             <w:rStyle w:val="Hyperlink"/>
           </w:rPr>
-          <w:t>/yehuda-d/ToDoList2/tree/main</w:t>
+          <w:t>yehuda-d/ToDoList2/tree/main</w:t>
         </w:r>
       </w:hyperlink>
     </w:p>

</xml_diff>

<commit_message>
we did option to delete task
</commit_message>
<xml_diff>
--- a/lesson1 4.11.25/github link.docx
+++ b/lesson1 4.11.25/github link.docx
@@ -2,17 +2,10 @@
 <file path=word/document.xml><?xml version="1.0" encoding="utf-8"?>
 <w:document xmlns:wpc="http://schemas.microsoft.com/office/word/2010/wordprocessingCanvas" xmlns:cx="http://schemas.microsoft.com/office/drawing/2014/chartex" xmlns:cx1="http://schemas.microsoft.com/office/drawing/2015/9/8/chartex" xmlns:cx2="http://schemas.microsoft.com/office/drawing/2015/10/21/chartex" xmlns:cx3="http://schemas.microsoft.com/office/drawing/2016/5/9/chartex" xmlns:cx4="http://schemas.microsoft.com/office/drawing/2016/5/10/chartex" xmlns:cx5="http://schemas.microsoft.com/office/drawing/2016/5/11/chartex" xmlns:cx6="http://schemas.microsoft.com/office/drawing/2016/5/12/chartex" xmlns:cx7="http://schemas.microsoft.com/office/drawing/2016/5/13/chartex" xmlns:cx8="http://schemas.microsoft.com/office/drawing/2016/5/14/chartex" xmlns:mc="http://schemas.openxmlformats.org/markup-compatibility/2006" xmlns:aink="http://schemas.microsoft.com/office/drawing/2016/ink" xmlns:am3d="http://schemas.microsoft.com/office/drawing/2017/model3d" xmlns:o="urn:schemas-microsoft-com:office:office" xmlns:oel="http://schemas.microsoft.com/office/2019/extlst" xmlns:r="http://schemas.openxmlformats.org/officeDocument/2006/relationships" xmlns:m="http://schemas.openxmlformats.org/officeDocument/2006/math" xmlns:v="urn:schemas-microsoft-com:vml" xmlns:wp14="http://schemas.microsoft.com/office/word/2010/wordprocessingDrawing" xmlns:wp="http://schemas.openxmlformats.org/drawingml/2006/wordprocessingDrawing" xmlns:w10="urn:schemas-microsoft-com:office:word" xmlns:w="http://schemas.openxmlformats.org/wordprocessingml/2006/main" xmlns:w14="http://schemas.microsoft.com/office/word/2010/wordml" xmlns:w15="http://schemas.microsoft.com/office/word/2012/wordml" xmlns:w16cex="http://schemas.microsoft.com/office/word/2018/wordml/cex" xmlns:w16cid="http://schemas.microsoft.com/office/word/2016/wordml/cid" xmlns:w16="http://schemas.microsoft.com/office/word/2018/wordml" xmlns:w16du="http://schemas.microsoft.com/office/word/2023/wordml/word16du" xmlns:w16sdtdh="http://schemas.microsoft.com/office/word/2020/wordml/sdtdatahash" xmlns:w16sdtfl="http://schemas.microsoft.com/office/word/2024/wordml/sdtformatlock" xmlns:w16se="http://schemas.microsoft.com/office/word/2015/wordml/symex" xmlns:wpg="http://schemas.microsoft.com/office/word/2010/wordprocessingGroup" xmlns:wpi="http://schemas.microsoft.com/office/word/2010/wordprocessingInk" xmlns:wne="http://schemas.microsoft.com/office/word/2006/wordml" xmlns:wps="http://schemas.microsoft.com/office/word/2010/wordprocessingShape" mc:Ignorable="w14 w15 w16se w16cid w16 w16cex w16sdtdh w16sdtfl w16du wp14">
   <w:body>
-    <w:p/>
     <w:p>
       <w:pPr>
         <w:rPr>
-          <w:rtl/>
-        </w:rPr>
-      </w:pPr>
-    </w:p>
-    <w:p>
-      <w:pPr>
-        <w:rPr>
+          <w:rFonts w:hint="cs"/>
           <w:rtl/>
         </w:rPr>
       </w:pPr>
@@ -29,21 +22,36 @@
           <w:rPr>
             <w:rStyle w:val="Hyperlink"/>
           </w:rPr>
-          <w:t>https://github.com</w:t>
+          <w:t>https://github.com/yehu</w:t>
         </w:r>
         <w:r>
           <w:rPr>
             <w:rStyle w:val="Hyperlink"/>
           </w:rPr>
-          <w:t>/</w:t>
+          <w:t>d</w:t>
         </w:r>
         <w:r>
           <w:rPr>
             <w:rStyle w:val="Hyperlink"/>
           </w:rPr>
-          <w:t>yehuda-d/ToDoList2/tree/main</w:t>
+          <w:t>a-d/ToDoList2/tree/main/lesson1%204.11.25</w:t>
         </w:r>
       </w:hyperlink>
+    </w:p>
+    <w:p>
+      <w:pPr>
+        <w:rPr>
+          <w:rtl/>
+        </w:rPr>
+      </w:pPr>
+    </w:p>
+    <w:p>
+      <w:pPr>
+        <w:rPr>
+          <w:rFonts w:hint="cs"/>
+          <w:rtl/>
+        </w:rPr>
+      </w:pPr>
     </w:p>
     <w:sectPr>
       <w:pgSz w:w="11906" w:h="16838"/>

</xml_diff>